<commit_message>
Set Balloon Text style to TNR 12
</commit_message>
<xml_diff>
--- a/data/scaffold.docx
+++ b/data/scaffold.docx
@@ -1,6 +1,6 @@
 
 <file path=word/document.xml><?xml version="1.0" encoding="utf-8"?>
-<w:document xmlns:wpc="http://schemas.microsoft.com/office/word/2010/wordprocessingCanvas" xmlns:cx="http://schemas.microsoft.com/office/drawing/2014/chartex" xmlns:cx1="http://schemas.microsoft.com/office/drawing/2015/9/8/chartex" xmlns:cx2="http://schemas.microsoft.com/office/drawing/2015/10/21/chartex" xmlns:cx3="http://schemas.microsoft.com/office/drawing/2016/5/9/chartex" xmlns:cx4="http://schemas.microsoft.com/office/drawing/2016/5/10/chartex" xmlns:cx5="http://schemas.microsoft.com/office/drawing/2016/5/11/chartex" xmlns:cx6="http://schemas.microsoft.com/office/drawing/2016/5/12/chartex" xmlns:cx7="http://schemas.microsoft.com/office/drawing/2016/5/13/chartex" xmlns:cx8="http://schemas.microsoft.com/office/drawing/2016/5/14/chartex" xmlns:mc="http://schemas.openxmlformats.org/markup-compatibility/2006" xmlns:aink="http://schemas.microsoft.com/office/drawing/2016/ink" xmlns:am3d="http://schemas.microsoft.com/office/drawing/2017/model3d" xmlns:o="urn:schemas-microsoft-com:office:office" xmlns:oel="http://schemas.microsoft.com/office/2019/extlst" xmlns:r="http://schemas.openxmlformats.org/officeDocument/2006/relationships" xmlns:m="http://schemas.openxmlformats.org/officeDocument/2006/math" xmlns:v="urn:schemas-microsoft-com:vml" xmlns:wp14="http://schemas.microsoft.com/office/word/2010/wordprocessingDrawing" xmlns:wp="http://schemas.openxmlformats.org/drawingml/2006/wordprocessingDrawing" xmlns:w10="urn:schemas-microsoft-com:office:word" xmlns:w="http://schemas.openxmlformats.org/wordprocessingml/2006/main" xmlns:w14="http://schemas.microsoft.com/office/word/2010/wordml" xmlns:w15="http://schemas.microsoft.com/office/word/2012/wordml" xmlns:w16cex="http://schemas.microsoft.com/office/word/2018/wordml/cex" xmlns:w16cid="http://schemas.microsoft.com/office/word/2016/wordml/cid" xmlns:w16="http://schemas.microsoft.com/office/word/2018/wordml" xmlns:w16sdtdh="http://schemas.microsoft.com/office/word/2020/wordml/sdtdatahash" xmlns:w16se="http://schemas.microsoft.com/office/word/2015/wordml/symex" xmlns:wpg="http://schemas.microsoft.com/office/word/2010/wordprocessingGroup" xmlns:wpi="http://schemas.microsoft.com/office/word/2010/wordprocessingInk" xmlns:wne="http://schemas.microsoft.com/office/word/2006/wordml" xmlns:wps="http://schemas.microsoft.com/office/word/2010/wordprocessingShape" mc:Ignorable="w14 w15 w16se w16cid w16 w16cex w16sdtdh wp14">
+<w:document xmlns:wpc="http://schemas.microsoft.com/office/word/2010/wordprocessingCanvas" xmlns:cx="http://schemas.microsoft.com/office/drawing/2014/chartex" xmlns:cx1="http://schemas.microsoft.com/office/drawing/2015/9/8/chartex" xmlns:cx2="http://schemas.microsoft.com/office/drawing/2015/10/21/chartex" xmlns:cx3="http://schemas.microsoft.com/office/drawing/2016/5/9/chartex" xmlns:cx4="http://schemas.microsoft.com/office/drawing/2016/5/10/chartex" xmlns:cx5="http://schemas.microsoft.com/office/drawing/2016/5/11/chartex" xmlns:cx6="http://schemas.microsoft.com/office/drawing/2016/5/12/chartex" xmlns:cx7="http://schemas.microsoft.com/office/drawing/2016/5/13/chartex" xmlns:cx8="http://schemas.microsoft.com/office/drawing/2016/5/14/chartex" xmlns:mc="http://schemas.openxmlformats.org/markup-compatibility/2006" xmlns:aink="http://schemas.microsoft.com/office/drawing/2016/ink" xmlns:am3d="http://schemas.microsoft.com/office/drawing/2017/model3d" xmlns:o="urn:schemas-microsoft-com:office:office" xmlns:oel="http://schemas.microsoft.com/office/2019/extlst" xmlns:r="http://schemas.openxmlformats.org/officeDocument/2006/relationships" xmlns:m="http://schemas.openxmlformats.org/officeDocument/2006/math" xmlns:v="urn:schemas-microsoft-com:vml" xmlns:wp14="http://schemas.microsoft.com/office/word/2010/wordprocessingDrawing" xmlns:wp="http://schemas.openxmlformats.org/drawingml/2006/wordprocessingDrawing" xmlns:w10="urn:schemas-microsoft-com:office:word" xmlns:w="http://schemas.openxmlformats.org/wordprocessingml/2006/main" xmlns:w14="http://schemas.microsoft.com/office/word/2010/wordml" xmlns:w15="http://schemas.microsoft.com/office/word/2012/wordml" xmlns:w16cex="http://schemas.microsoft.com/office/word/2018/wordml/cex" xmlns:w16cid="http://schemas.microsoft.com/office/word/2016/wordml/cid" xmlns:w16="http://schemas.microsoft.com/office/word/2018/wordml" xmlns:w16du="http://schemas.microsoft.com/office/word/2023/wordml/word16du" xmlns:w16sdtdh="http://schemas.microsoft.com/office/word/2020/wordml/sdtdatahash" xmlns:w16sdtfl="http://schemas.microsoft.com/office/word/2024/wordml/sdtformatlock" xmlns:w16se="http://schemas.microsoft.com/office/word/2015/wordml/symex" xmlns:wpg="http://schemas.microsoft.com/office/word/2010/wordprocessingGroup" xmlns:wpi="http://schemas.microsoft.com/office/word/2010/wordprocessingInk" xmlns:wne="http://schemas.microsoft.com/office/word/2006/wordml" xmlns:wps="http://schemas.microsoft.com/office/word/2010/wordprocessingShape" mc:Ignorable="w14 w15 w16se w16cid w16 w16cex w16sdtdh w16sdtfl w16du wp14">
   <w:body>
     <w:p/>
     <w:sectPr>
@@ -20,7 +20,7 @@
 </file>
 
 <file path=word/endnotes.xml><?xml version="1.0" encoding="utf-8"?>
-<w:endnotes xmlns:wpc="http://schemas.microsoft.com/office/word/2010/wordprocessingCanvas" xmlns:cx="http://schemas.microsoft.com/office/drawing/2014/chartex" xmlns:cx1="http://schemas.microsoft.com/office/drawing/2015/9/8/chartex" xmlns:cx2="http://schemas.microsoft.com/office/drawing/2015/10/21/chartex" xmlns:cx3="http://schemas.microsoft.com/office/drawing/2016/5/9/chartex" xmlns:cx4="http://schemas.microsoft.com/office/drawing/2016/5/10/chartex" xmlns:cx5="http://schemas.microsoft.com/office/drawing/2016/5/11/chartex" xmlns:cx6="http://schemas.microsoft.com/office/drawing/2016/5/12/chartex" xmlns:cx7="http://schemas.microsoft.com/office/drawing/2016/5/13/chartex" xmlns:cx8="http://schemas.microsoft.com/office/drawing/2016/5/14/chartex" xmlns:mc="http://schemas.openxmlformats.org/markup-compatibility/2006" xmlns:aink="http://schemas.microsoft.com/office/drawing/2016/ink" xmlns:am3d="http://schemas.microsoft.com/office/drawing/2017/model3d" xmlns:o="urn:schemas-microsoft-com:office:office" xmlns:oel="http://schemas.microsoft.com/office/2019/extlst" xmlns:r="http://schemas.openxmlformats.org/officeDocument/2006/relationships" xmlns:m="http://schemas.openxmlformats.org/officeDocument/2006/math" xmlns:v="urn:schemas-microsoft-com:vml" xmlns:wp14="http://schemas.microsoft.com/office/word/2010/wordprocessingDrawing" xmlns:wp="http://schemas.openxmlformats.org/drawingml/2006/wordprocessingDrawing" xmlns:w10="urn:schemas-microsoft-com:office:word" xmlns:w="http://schemas.openxmlformats.org/wordprocessingml/2006/main" xmlns:w14="http://schemas.microsoft.com/office/word/2010/wordml" xmlns:w15="http://schemas.microsoft.com/office/word/2012/wordml" xmlns:w16cex="http://schemas.microsoft.com/office/word/2018/wordml/cex" xmlns:w16cid="http://schemas.microsoft.com/office/word/2016/wordml/cid" xmlns:w16="http://schemas.microsoft.com/office/word/2018/wordml" xmlns:w16sdtdh="http://schemas.microsoft.com/office/word/2020/wordml/sdtdatahash" xmlns:w16se="http://schemas.microsoft.com/office/word/2015/wordml/symex" xmlns:wpg="http://schemas.microsoft.com/office/word/2010/wordprocessingGroup" xmlns:wpi="http://schemas.microsoft.com/office/word/2010/wordprocessingInk" xmlns:wne="http://schemas.microsoft.com/office/word/2006/wordml" xmlns:wps="http://schemas.microsoft.com/office/word/2010/wordprocessingShape" mc:Ignorable="w14 w15 w16se w16cid w16 w16cex w16sdtdh wp14">
+<w:endnotes xmlns:wpc="http://schemas.microsoft.com/office/word/2010/wordprocessingCanvas" xmlns:cx="http://schemas.microsoft.com/office/drawing/2014/chartex" xmlns:cx1="http://schemas.microsoft.com/office/drawing/2015/9/8/chartex" xmlns:cx2="http://schemas.microsoft.com/office/drawing/2015/10/21/chartex" xmlns:cx3="http://schemas.microsoft.com/office/drawing/2016/5/9/chartex" xmlns:cx4="http://schemas.microsoft.com/office/drawing/2016/5/10/chartex" xmlns:cx5="http://schemas.microsoft.com/office/drawing/2016/5/11/chartex" xmlns:cx6="http://schemas.microsoft.com/office/drawing/2016/5/12/chartex" xmlns:cx7="http://schemas.microsoft.com/office/drawing/2016/5/13/chartex" xmlns:cx8="http://schemas.microsoft.com/office/drawing/2016/5/14/chartex" xmlns:mc="http://schemas.openxmlformats.org/markup-compatibility/2006" xmlns:aink="http://schemas.microsoft.com/office/drawing/2016/ink" xmlns:am3d="http://schemas.microsoft.com/office/drawing/2017/model3d" xmlns:o="urn:schemas-microsoft-com:office:office" xmlns:oel="http://schemas.microsoft.com/office/2019/extlst" xmlns:r="http://schemas.openxmlformats.org/officeDocument/2006/relationships" xmlns:m="http://schemas.openxmlformats.org/officeDocument/2006/math" xmlns:v="urn:schemas-microsoft-com:vml" xmlns:wp14="http://schemas.microsoft.com/office/word/2010/wordprocessingDrawing" xmlns:wp="http://schemas.openxmlformats.org/drawingml/2006/wordprocessingDrawing" xmlns:w10="urn:schemas-microsoft-com:office:word" xmlns:w="http://schemas.openxmlformats.org/wordprocessingml/2006/main" xmlns:w14="http://schemas.microsoft.com/office/word/2010/wordml" xmlns:w15="http://schemas.microsoft.com/office/word/2012/wordml" xmlns:w16cex="http://schemas.microsoft.com/office/word/2018/wordml/cex" xmlns:w16cid="http://schemas.microsoft.com/office/word/2016/wordml/cid" xmlns:w16="http://schemas.microsoft.com/office/word/2018/wordml" xmlns:w16du="http://schemas.microsoft.com/office/word/2023/wordml/word16du" xmlns:w16sdtdh="http://schemas.microsoft.com/office/word/2020/wordml/sdtdatahash" xmlns:w16sdtfl="http://schemas.microsoft.com/office/word/2024/wordml/sdtformatlock" xmlns:w16se="http://schemas.microsoft.com/office/word/2015/wordml/symex" xmlns:wpg="http://schemas.microsoft.com/office/word/2010/wordprocessingGroup" xmlns:wpi="http://schemas.microsoft.com/office/word/2010/wordprocessingInk" xmlns:wne="http://schemas.microsoft.com/office/word/2006/wordml" xmlns:wps="http://schemas.microsoft.com/office/word/2010/wordprocessingShape" mc:Ignorable="w14 w15 w16se w16cid w16 w16cex w16sdtdh w16sdtfl w16du wp14">
   <w:endnote w:type="separator" w:id="-1">
     <w:p>
       <w:pPr>
@@ -45,7 +45,7 @@
 </file>
 
 <file path=word/footer1.xml><?xml version="1.0" encoding="utf-8"?>
-<w:ftr xmlns:wpc="http://schemas.microsoft.com/office/word/2010/wordprocessingCanvas" xmlns:cx="http://schemas.microsoft.com/office/drawing/2014/chartex" xmlns:cx1="http://schemas.microsoft.com/office/drawing/2015/9/8/chartex" xmlns:cx2="http://schemas.microsoft.com/office/drawing/2015/10/21/chartex" xmlns:cx3="http://schemas.microsoft.com/office/drawing/2016/5/9/chartex" xmlns:cx4="http://schemas.microsoft.com/office/drawing/2016/5/10/chartex" xmlns:cx5="http://schemas.microsoft.com/office/drawing/2016/5/11/chartex" xmlns:cx6="http://schemas.microsoft.com/office/drawing/2016/5/12/chartex" xmlns:cx7="http://schemas.microsoft.com/office/drawing/2016/5/13/chartex" xmlns:cx8="http://schemas.microsoft.com/office/drawing/2016/5/14/chartex" xmlns:mc="http://schemas.openxmlformats.org/markup-compatibility/2006" xmlns:aink="http://schemas.microsoft.com/office/drawing/2016/ink" xmlns:am3d="http://schemas.microsoft.com/office/drawing/2017/model3d" xmlns:o="urn:schemas-microsoft-com:office:office" xmlns:oel="http://schemas.microsoft.com/office/2019/extlst" xmlns:r="http://schemas.openxmlformats.org/officeDocument/2006/relationships" xmlns:m="http://schemas.openxmlformats.org/officeDocument/2006/math" xmlns:v="urn:schemas-microsoft-com:vml" xmlns:wp14="http://schemas.microsoft.com/office/word/2010/wordprocessingDrawing" xmlns:wp="http://schemas.openxmlformats.org/drawingml/2006/wordprocessingDrawing" xmlns:w10="urn:schemas-microsoft-com:office:word" xmlns:w="http://schemas.openxmlformats.org/wordprocessingml/2006/main" xmlns:w14="http://schemas.microsoft.com/office/word/2010/wordml" xmlns:w15="http://schemas.microsoft.com/office/word/2012/wordml" xmlns:w16cex="http://schemas.microsoft.com/office/word/2018/wordml/cex" xmlns:w16cid="http://schemas.microsoft.com/office/word/2016/wordml/cid" xmlns:w16="http://schemas.microsoft.com/office/word/2018/wordml" xmlns:w16sdtdh="http://schemas.microsoft.com/office/word/2020/wordml/sdtdatahash" xmlns:w16se="http://schemas.microsoft.com/office/word/2015/wordml/symex" xmlns:wpg="http://schemas.microsoft.com/office/word/2010/wordprocessingGroup" xmlns:wpi="http://schemas.microsoft.com/office/word/2010/wordprocessingInk" xmlns:wne="http://schemas.microsoft.com/office/word/2006/wordml" xmlns:wps="http://schemas.microsoft.com/office/word/2010/wordprocessingShape" mc:Ignorable="w14 w15 w16se w16cid w16 w16cex w16sdtdh wp14">
+<w:ftr xmlns:wpc="http://schemas.microsoft.com/office/word/2010/wordprocessingCanvas" xmlns:cx="http://schemas.microsoft.com/office/drawing/2014/chartex" xmlns:cx1="http://schemas.microsoft.com/office/drawing/2015/9/8/chartex" xmlns:cx2="http://schemas.microsoft.com/office/drawing/2015/10/21/chartex" xmlns:cx3="http://schemas.microsoft.com/office/drawing/2016/5/9/chartex" xmlns:cx4="http://schemas.microsoft.com/office/drawing/2016/5/10/chartex" xmlns:cx5="http://schemas.microsoft.com/office/drawing/2016/5/11/chartex" xmlns:cx6="http://schemas.microsoft.com/office/drawing/2016/5/12/chartex" xmlns:cx7="http://schemas.microsoft.com/office/drawing/2016/5/13/chartex" xmlns:cx8="http://schemas.microsoft.com/office/drawing/2016/5/14/chartex" xmlns:mc="http://schemas.openxmlformats.org/markup-compatibility/2006" xmlns:aink="http://schemas.microsoft.com/office/drawing/2016/ink" xmlns:am3d="http://schemas.microsoft.com/office/drawing/2017/model3d" xmlns:o="urn:schemas-microsoft-com:office:office" xmlns:oel="http://schemas.microsoft.com/office/2019/extlst" xmlns:r="http://schemas.openxmlformats.org/officeDocument/2006/relationships" xmlns:m="http://schemas.openxmlformats.org/officeDocument/2006/math" xmlns:v="urn:schemas-microsoft-com:vml" xmlns:wp14="http://schemas.microsoft.com/office/word/2010/wordprocessingDrawing" xmlns:wp="http://schemas.openxmlformats.org/drawingml/2006/wordprocessingDrawing" xmlns:w10="urn:schemas-microsoft-com:office:word" xmlns:w="http://schemas.openxmlformats.org/wordprocessingml/2006/main" xmlns:w14="http://schemas.microsoft.com/office/word/2010/wordml" xmlns:w15="http://schemas.microsoft.com/office/word/2012/wordml" xmlns:w16cex="http://schemas.microsoft.com/office/word/2018/wordml/cex" xmlns:w16cid="http://schemas.microsoft.com/office/word/2016/wordml/cid" xmlns:w16="http://schemas.microsoft.com/office/word/2018/wordml" xmlns:w16du="http://schemas.microsoft.com/office/word/2023/wordml/word16du" xmlns:w16sdtdh="http://schemas.microsoft.com/office/word/2020/wordml/sdtdatahash" xmlns:w16sdtfl="http://schemas.microsoft.com/office/word/2024/wordml/sdtformatlock" xmlns:w16se="http://schemas.microsoft.com/office/word/2015/wordml/symex" xmlns:wpg="http://schemas.microsoft.com/office/word/2010/wordprocessingGroup" xmlns:wpi="http://schemas.microsoft.com/office/word/2010/wordprocessingInk" xmlns:wne="http://schemas.microsoft.com/office/word/2006/wordml" xmlns:wps="http://schemas.microsoft.com/office/word/2010/wordprocessingShape" mc:Ignorable="w14 w15 w16se w16cid w16 w16cex w16sdtdh w16sdtfl w16du wp14">
   <w:p>
     <w:pPr>
       <w:pStyle w:val="Footer"/>
@@ -55,7 +55,7 @@
 </file>
 
 <file path=word/footer2.xml><?xml version="1.0" encoding="utf-8"?>
-<w:ftr xmlns:wpc="http://schemas.microsoft.com/office/word/2010/wordprocessingCanvas" xmlns:cx="http://schemas.microsoft.com/office/drawing/2014/chartex" xmlns:cx1="http://schemas.microsoft.com/office/drawing/2015/9/8/chartex" xmlns:cx2="http://schemas.microsoft.com/office/drawing/2015/10/21/chartex" xmlns:cx3="http://schemas.microsoft.com/office/drawing/2016/5/9/chartex" xmlns:cx4="http://schemas.microsoft.com/office/drawing/2016/5/10/chartex" xmlns:cx5="http://schemas.microsoft.com/office/drawing/2016/5/11/chartex" xmlns:cx6="http://schemas.microsoft.com/office/drawing/2016/5/12/chartex" xmlns:cx7="http://schemas.microsoft.com/office/drawing/2016/5/13/chartex" xmlns:cx8="http://schemas.microsoft.com/office/drawing/2016/5/14/chartex" xmlns:mc="http://schemas.openxmlformats.org/markup-compatibility/2006" xmlns:aink="http://schemas.microsoft.com/office/drawing/2016/ink" xmlns:am3d="http://schemas.microsoft.com/office/drawing/2017/model3d" xmlns:o="urn:schemas-microsoft-com:office:office" xmlns:oel="http://schemas.microsoft.com/office/2019/extlst" xmlns:r="http://schemas.openxmlformats.org/officeDocument/2006/relationships" xmlns:m="http://schemas.openxmlformats.org/officeDocument/2006/math" xmlns:v="urn:schemas-microsoft-com:vml" xmlns:wp14="http://schemas.microsoft.com/office/word/2010/wordprocessingDrawing" xmlns:wp="http://schemas.openxmlformats.org/drawingml/2006/wordprocessingDrawing" xmlns:w10="urn:schemas-microsoft-com:office:word" xmlns:w="http://schemas.openxmlformats.org/wordprocessingml/2006/main" xmlns:w14="http://schemas.microsoft.com/office/word/2010/wordml" xmlns:w15="http://schemas.microsoft.com/office/word/2012/wordml" xmlns:w16cex="http://schemas.microsoft.com/office/word/2018/wordml/cex" xmlns:w16cid="http://schemas.microsoft.com/office/word/2016/wordml/cid" xmlns:w16="http://schemas.microsoft.com/office/word/2018/wordml" xmlns:w16sdtdh="http://schemas.microsoft.com/office/word/2020/wordml/sdtdatahash" xmlns:w16se="http://schemas.microsoft.com/office/word/2015/wordml/symex" xmlns:wpg="http://schemas.microsoft.com/office/word/2010/wordprocessingGroup" xmlns:wpi="http://schemas.microsoft.com/office/word/2010/wordprocessingInk" xmlns:wne="http://schemas.microsoft.com/office/word/2006/wordml" xmlns:wps="http://schemas.microsoft.com/office/word/2010/wordprocessingShape" mc:Ignorable="w14 w15 w16se w16cid w16 w16cex w16sdtdh wp14">
+<w:ftr xmlns:wpc="http://schemas.microsoft.com/office/word/2010/wordprocessingCanvas" xmlns:cx="http://schemas.microsoft.com/office/drawing/2014/chartex" xmlns:cx1="http://schemas.microsoft.com/office/drawing/2015/9/8/chartex" xmlns:cx2="http://schemas.microsoft.com/office/drawing/2015/10/21/chartex" xmlns:cx3="http://schemas.microsoft.com/office/drawing/2016/5/9/chartex" xmlns:cx4="http://schemas.microsoft.com/office/drawing/2016/5/10/chartex" xmlns:cx5="http://schemas.microsoft.com/office/drawing/2016/5/11/chartex" xmlns:cx6="http://schemas.microsoft.com/office/drawing/2016/5/12/chartex" xmlns:cx7="http://schemas.microsoft.com/office/drawing/2016/5/13/chartex" xmlns:cx8="http://schemas.microsoft.com/office/drawing/2016/5/14/chartex" xmlns:mc="http://schemas.openxmlformats.org/markup-compatibility/2006" xmlns:aink="http://schemas.microsoft.com/office/drawing/2016/ink" xmlns:am3d="http://schemas.microsoft.com/office/drawing/2017/model3d" xmlns:o="urn:schemas-microsoft-com:office:office" xmlns:oel="http://schemas.microsoft.com/office/2019/extlst" xmlns:r="http://schemas.openxmlformats.org/officeDocument/2006/relationships" xmlns:m="http://schemas.openxmlformats.org/officeDocument/2006/math" xmlns:v="urn:schemas-microsoft-com:vml" xmlns:wp14="http://schemas.microsoft.com/office/word/2010/wordprocessingDrawing" xmlns:wp="http://schemas.openxmlformats.org/drawingml/2006/wordprocessingDrawing" xmlns:w10="urn:schemas-microsoft-com:office:word" xmlns:w="http://schemas.openxmlformats.org/wordprocessingml/2006/main" xmlns:w14="http://schemas.microsoft.com/office/word/2010/wordml" xmlns:w15="http://schemas.microsoft.com/office/word/2012/wordml" xmlns:w16cex="http://schemas.microsoft.com/office/word/2018/wordml/cex" xmlns:w16cid="http://schemas.microsoft.com/office/word/2016/wordml/cid" xmlns:w16="http://schemas.microsoft.com/office/word/2018/wordml" xmlns:w16du="http://schemas.microsoft.com/office/word/2023/wordml/word16du" xmlns:w16sdtdh="http://schemas.microsoft.com/office/word/2020/wordml/sdtdatahash" xmlns:w16sdtfl="http://schemas.microsoft.com/office/word/2024/wordml/sdtformatlock" xmlns:w16se="http://schemas.microsoft.com/office/word/2015/wordml/symex" xmlns:wpg="http://schemas.microsoft.com/office/word/2010/wordprocessingGroup" xmlns:wpi="http://schemas.microsoft.com/office/word/2010/wordprocessingInk" xmlns:wne="http://schemas.microsoft.com/office/word/2006/wordml" xmlns:wps="http://schemas.microsoft.com/office/word/2010/wordprocessingShape" mc:Ignorable="w14 w15 w16se w16cid w16 w16cex w16sdtdh w16sdtfl w16du wp14">
   <w:p>
     <w:pPr>
       <w:pStyle w:val="Footer"/>
@@ -100,7 +100,7 @@
 </file>
 
 <file path=word/footer3.xml><?xml version="1.0" encoding="utf-8"?>
-<w:ftr xmlns:wpc="http://schemas.microsoft.com/office/word/2010/wordprocessingCanvas" xmlns:cx="http://schemas.microsoft.com/office/drawing/2014/chartex" xmlns:cx1="http://schemas.microsoft.com/office/drawing/2015/9/8/chartex" xmlns:cx2="http://schemas.microsoft.com/office/drawing/2015/10/21/chartex" xmlns:cx3="http://schemas.microsoft.com/office/drawing/2016/5/9/chartex" xmlns:cx4="http://schemas.microsoft.com/office/drawing/2016/5/10/chartex" xmlns:cx5="http://schemas.microsoft.com/office/drawing/2016/5/11/chartex" xmlns:cx6="http://schemas.microsoft.com/office/drawing/2016/5/12/chartex" xmlns:cx7="http://schemas.microsoft.com/office/drawing/2016/5/13/chartex" xmlns:cx8="http://schemas.microsoft.com/office/drawing/2016/5/14/chartex" xmlns:mc="http://schemas.openxmlformats.org/markup-compatibility/2006" xmlns:aink="http://schemas.microsoft.com/office/drawing/2016/ink" xmlns:am3d="http://schemas.microsoft.com/office/drawing/2017/model3d" xmlns:o="urn:schemas-microsoft-com:office:office" xmlns:oel="http://schemas.microsoft.com/office/2019/extlst" xmlns:r="http://schemas.openxmlformats.org/officeDocument/2006/relationships" xmlns:m="http://schemas.openxmlformats.org/officeDocument/2006/math" xmlns:v="urn:schemas-microsoft-com:vml" xmlns:wp14="http://schemas.microsoft.com/office/word/2010/wordprocessingDrawing" xmlns:wp="http://schemas.openxmlformats.org/drawingml/2006/wordprocessingDrawing" xmlns:w10="urn:schemas-microsoft-com:office:word" xmlns:w="http://schemas.openxmlformats.org/wordprocessingml/2006/main" xmlns:w14="http://schemas.microsoft.com/office/word/2010/wordml" xmlns:w15="http://schemas.microsoft.com/office/word/2012/wordml" xmlns:w16cex="http://schemas.microsoft.com/office/word/2018/wordml/cex" xmlns:w16cid="http://schemas.microsoft.com/office/word/2016/wordml/cid" xmlns:w16="http://schemas.microsoft.com/office/word/2018/wordml" xmlns:w16sdtdh="http://schemas.microsoft.com/office/word/2020/wordml/sdtdatahash" xmlns:w16se="http://schemas.microsoft.com/office/word/2015/wordml/symex" xmlns:wpg="http://schemas.microsoft.com/office/word/2010/wordprocessingGroup" xmlns:wpi="http://schemas.microsoft.com/office/word/2010/wordprocessingInk" xmlns:wne="http://schemas.microsoft.com/office/word/2006/wordml" xmlns:wps="http://schemas.microsoft.com/office/word/2010/wordprocessingShape" mc:Ignorable="w14 w15 w16se w16cid w16 w16cex w16sdtdh wp14">
+<w:ftr xmlns:wpc="http://schemas.microsoft.com/office/word/2010/wordprocessingCanvas" xmlns:cx="http://schemas.microsoft.com/office/drawing/2014/chartex" xmlns:cx1="http://schemas.microsoft.com/office/drawing/2015/9/8/chartex" xmlns:cx2="http://schemas.microsoft.com/office/drawing/2015/10/21/chartex" xmlns:cx3="http://schemas.microsoft.com/office/drawing/2016/5/9/chartex" xmlns:cx4="http://schemas.microsoft.com/office/drawing/2016/5/10/chartex" xmlns:cx5="http://schemas.microsoft.com/office/drawing/2016/5/11/chartex" xmlns:cx6="http://schemas.microsoft.com/office/drawing/2016/5/12/chartex" xmlns:cx7="http://schemas.microsoft.com/office/drawing/2016/5/13/chartex" xmlns:cx8="http://schemas.microsoft.com/office/drawing/2016/5/14/chartex" xmlns:mc="http://schemas.openxmlformats.org/markup-compatibility/2006" xmlns:aink="http://schemas.microsoft.com/office/drawing/2016/ink" xmlns:am3d="http://schemas.microsoft.com/office/drawing/2017/model3d" xmlns:o="urn:schemas-microsoft-com:office:office" xmlns:oel="http://schemas.microsoft.com/office/2019/extlst" xmlns:r="http://schemas.openxmlformats.org/officeDocument/2006/relationships" xmlns:m="http://schemas.openxmlformats.org/officeDocument/2006/math" xmlns:v="urn:schemas-microsoft-com:vml" xmlns:wp14="http://schemas.microsoft.com/office/word/2010/wordprocessingDrawing" xmlns:wp="http://schemas.openxmlformats.org/drawingml/2006/wordprocessingDrawing" xmlns:w10="urn:schemas-microsoft-com:office:word" xmlns:w="http://schemas.openxmlformats.org/wordprocessingml/2006/main" xmlns:w14="http://schemas.microsoft.com/office/word/2010/wordml" xmlns:w15="http://schemas.microsoft.com/office/word/2012/wordml" xmlns:w16cex="http://schemas.microsoft.com/office/word/2018/wordml/cex" xmlns:w16cid="http://schemas.microsoft.com/office/word/2016/wordml/cid" xmlns:w16="http://schemas.microsoft.com/office/word/2018/wordml" xmlns:w16du="http://schemas.microsoft.com/office/word/2023/wordml/word16du" xmlns:w16sdtdh="http://schemas.microsoft.com/office/word/2020/wordml/sdtdatahash" xmlns:w16sdtfl="http://schemas.microsoft.com/office/word/2024/wordml/sdtformatlock" xmlns:w16se="http://schemas.microsoft.com/office/word/2015/wordml/symex" xmlns:wpg="http://schemas.microsoft.com/office/word/2010/wordprocessingGroup" xmlns:wpi="http://schemas.microsoft.com/office/word/2010/wordprocessingInk" xmlns:wne="http://schemas.microsoft.com/office/word/2006/wordml" xmlns:wps="http://schemas.microsoft.com/office/word/2010/wordprocessingShape" mc:Ignorable="w14 w15 w16se w16cid w16 w16cex w16sdtdh w16sdtfl w16du wp14">
   <w:p>
     <w:pPr>
       <w:pStyle w:val="Footer"/>
@@ -110,7 +110,7 @@
 </file>
 
 <file path=word/footnotes.xml><?xml version="1.0" encoding="utf-8"?>
-<w:footnotes xmlns:wpc="http://schemas.microsoft.com/office/word/2010/wordprocessingCanvas" xmlns:cx="http://schemas.microsoft.com/office/drawing/2014/chartex" xmlns:cx1="http://schemas.microsoft.com/office/drawing/2015/9/8/chartex" xmlns:cx2="http://schemas.microsoft.com/office/drawing/2015/10/21/chartex" xmlns:cx3="http://schemas.microsoft.com/office/drawing/2016/5/9/chartex" xmlns:cx4="http://schemas.microsoft.com/office/drawing/2016/5/10/chartex" xmlns:cx5="http://schemas.microsoft.com/office/drawing/2016/5/11/chartex" xmlns:cx6="http://schemas.microsoft.com/office/drawing/2016/5/12/chartex" xmlns:cx7="http://schemas.microsoft.com/office/drawing/2016/5/13/chartex" xmlns:cx8="http://schemas.microsoft.com/office/drawing/2016/5/14/chartex" xmlns:mc="http://schemas.openxmlformats.org/markup-compatibility/2006" xmlns:aink="http://schemas.microsoft.com/office/drawing/2016/ink" xmlns:am3d="http://schemas.microsoft.com/office/drawing/2017/model3d" xmlns:o="urn:schemas-microsoft-com:office:office" xmlns:oel="http://schemas.microsoft.com/office/2019/extlst" xmlns:r="http://schemas.openxmlformats.org/officeDocument/2006/relationships" xmlns:m="http://schemas.openxmlformats.org/officeDocument/2006/math" xmlns:v="urn:schemas-microsoft-com:vml" xmlns:wp14="http://schemas.microsoft.com/office/word/2010/wordprocessingDrawing" xmlns:wp="http://schemas.openxmlformats.org/drawingml/2006/wordprocessingDrawing" xmlns:w10="urn:schemas-microsoft-com:office:word" xmlns:w="http://schemas.openxmlformats.org/wordprocessingml/2006/main" xmlns:w14="http://schemas.microsoft.com/office/word/2010/wordml" xmlns:w15="http://schemas.microsoft.com/office/word/2012/wordml" xmlns:w16cex="http://schemas.microsoft.com/office/word/2018/wordml/cex" xmlns:w16cid="http://schemas.microsoft.com/office/word/2016/wordml/cid" xmlns:w16="http://schemas.microsoft.com/office/word/2018/wordml" xmlns:w16sdtdh="http://schemas.microsoft.com/office/word/2020/wordml/sdtdatahash" xmlns:w16se="http://schemas.microsoft.com/office/word/2015/wordml/symex" xmlns:wpg="http://schemas.microsoft.com/office/word/2010/wordprocessingGroup" xmlns:wpi="http://schemas.microsoft.com/office/word/2010/wordprocessingInk" xmlns:wne="http://schemas.microsoft.com/office/word/2006/wordml" xmlns:wps="http://schemas.microsoft.com/office/word/2010/wordprocessingShape" mc:Ignorable="w14 w15 w16se w16cid w16 w16cex w16sdtdh wp14">
+<w:footnotes xmlns:wpc="http://schemas.microsoft.com/office/word/2010/wordprocessingCanvas" xmlns:cx="http://schemas.microsoft.com/office/drawing/2014/chartex" xmlns:cx1="http://schemas.microsoft.com/office/drawing/2015/9/8/chartex" xmlns:cx2="http://schemas.microsoft.com/office/drawing/2015/10/21/chartex" xmlns:cx3="http://schemas.microsoft.com/office/drawing/2016/5/9/chartex" xmlns:cx4="http://schemas.microsoft.com/office/drawing/2016/5/10/chartex" xmlns:cx5="http://schemas.microsoft.com/office/drawing/2016/5/11/chartex" xmlns:cx6="http://schemas.microsoft.com/office/drawing/2016/5/12/chartex" xmlns:cx7="http://schemas.microsoft.com/office/drawing/2016/5/13/chartex" xmlns:cx8="http://schemas.microsoft.com/office/drawing/2016/5/14/chartex" xmlns:mc="http://schemas.openxmlformats.org/markup-compatibility/2006" xmlns:aink="http://schemas.microsoft.com/office/drawing/2016/ink" xmlns:am3d="http://schemas.microsoft.com/office/drawing/2017/model3d" xmlns:o="urn:schemas-microsoft-com:office:office" xmlns:oel="http://schemas.microsoft.com/office/2019/extlst" xmlns:r="http://schemas.openxmlformats.org/officeDocument/2006/relationships" xmlns:m="http://schemas.openxmlformats.org/officeDocument/2006/math" xmlns:v="urn:schemas-microsoft-com:vml" xmlns:wp14="http://schemas.microsoft.com/office/word/2010/wordprocessingDrawing" xmlns:wp="http://schemas.openxmlformats.org/drawingml/2006/wordprocessingDrawing" xmlns:w10="urn:schemas-microsoft-com:office:word" xmlns:w="http://schemas.openxmlformats.org/wordprocessingml/2006/main" xmlns:w14="http://schemas.microsoft.com/office/word/2010/wordml" xmlns:w15="http://schemas.microsoft.com/office/word/2012/wordml" xmlns:w16cex="http://schemas.microsoft.com/office/word/2018/wordml/cex" xmlns:w16cid="http://schemas.microsoft.com/office/word/2016/wordml/cid" xmlns:w16="http://schemas.microsoft.com/office/word/2018/wordml" xmlns:w16du="http://schemas.microsoft.com/office/word/2023/wordml/word16du" xmlns:w16sdtdh="http://schemas.microsoft.com/office/word/2020/wordml/sdtdatahash" xmlns:w16sdtfl="http://schemas.microsoft.com/office/word/2024/wordml/sdtformatlock" xmlns:w16se="http://schemas.microsoft.com/office/word/2015/wordml/symex" xmlns:wpg="http://schemas.microsoft.com/office/word/2010/wordprocessingGroup" xmlns:wpi="http://schemas.microsoft.com/office/word/2010/wordprocessingInk" xmlns:wne="http://schemas.microsoft.com/office/word/2006/wordml" xmlns:wps="http://schemas.microsoft.com/office/word/2010/wordprocessingShape" mc:Ignorable="w14 w15 w16se w16cid w16 w16cex w16sdtdh w16sdtfl w16du wp14">
   <w:footnote w:type="separator" w:id="-1">
     <w:p>
       <w:pPr>
@@ -135,7 +135,7 @@
 </file>
 
 <file path=word/header1.xml><?xml version="1.0" encoding="utf-8"?>
-<w:hdr xmlns:wpc="http://schemas.microsoft.com/office/word/2010/wordprocessingCanvas" xmlns:cx="http://schemas.microsoft.com/office/drawing/2014/chartex" xmlns:cx1="http://schemas.microsoft.com/office/drawing/2015/9/8/chartex" xmlns:cx2="http://schemas.microsoft.com/office/drawing/2015/10/21/chartex" xmlns:cx3="http://schemas.microsoft.com/office/drawing/2016/5/9/chartex" xmlns:cx4="http://schemas.microsoft.com/office/drawing/2016/5/10/chartex" xmlns:cx5="http://schemas.microsoft.com/office/drawing/2016/5/11/chartex" xmlns:cx6="http://schemas.microsoft.com/office/drawing/2016/5/12/chartex" xmlns:cx7="http://schemas.microsoft.com/office/drawing/2016/5/13/chartex" xmlns:cx8="http://schemas.microsoft.com/office/drawing/2016/5/14/chartex" xmlns:mc="http://schemas.openxmlformats.org/markup-compatibility/2006" xmlns:aink="http://schemas.microsoft.com/office/drawing/2016/ink" xmlns:am3d="http://schemas.microsoft.com/office/drawing/2017/model3d" xmlns:o="urn:schemas-microsoft-com:office:office" xmlns:oel="http://schemas.microsoft.com/office/2019/extlst" xmlns:r="http://schemas.openxmlformats.org/officeDocument/2006/relationships" xmlns:m="http://schemas.openxmlformats.org/officeDocument/2006/math" xmlns:v="urn:schemas-microsoft-com:vml" xmlns:wp14="http://schemas.microsoft.com/office/word/2010/wordprocessingDrawing" xmlns:wp="http://schemas.openxmlformats.org/drawingml/2006/wordprocessingDrawing" xmlns:w10="urn:schemas-microsoft-com:office:word" xmlns:w="http://schemas.openxmlformats.org/wordprocessingml/2006/main" xmlns:w14="http://schemas.microsoft.com/office/word/2010/wordml" xmlns:w15="http://schemas.microsoft.com/office/word/2012/wordml" xmlns:w16cex="http://schemas.microsoft.com/office/word/2018/wordml/cex" xmlns:w16cid="http://schemas.microsoft.com/office/word/2016/wordml/cid" xmlns:w16="http://schemas.microsoft.com/office/word/2018/wordml" xmlns:w16sdtdh="http://schemas.microsoft.com/office/word/2020/wordml/sdtdatahash" xmlns:w16se="http://schemas.microsoft.com/office/word/2015/wordml/symex" xmlns:wpg="http://schemas.microsoft.com/office/word/2010/wordprocessingGroup" xmlns:wpi="http://schemas.microsoft.com/office/word/2010/wordprocessingInk" xmlns:wne="http://schemas.microsoft.com/office/word/2006/wordml" xmlns:wps="http://schemas.microsoft.com/office/word/2010/wordprocessingShape" mc:Ignorable="w14 w15 w16se w16cid w16 w16cex w16sdtdh wp14">
+<w:hdr xmlns:wpc="http://schemas.microsoft.com/office/word/2010/wordprocessingCanvas" xmlns:cx="http://schemas.microsoft.com/office/drawing/2014/chartex" xmlns:cx1="http://schemas.microsoft.com/office/drawing/2015/9/8/chartex" xmlns:cx2="http://schemas.microsoft.com/office/drawing/2015/10/21/chartex" xmlns:cx3="http://schemas.microsoft.com/office/drawing/2016/5/9/chartex" xmlns:cx4="http://schemas.microsoft.com/office/drawing/2016/5/10/chartex" xmlns:cx5="http://schemas.microsoft.com/office/drawing/2016/5/11/chartex" xmlns:cx6="http://schemas.microsoft.com/office/drawing/2016/5/12/chartex" xmlns:cx7="http://schemas.microsoft.com/office/drawing/2016/5/13/chartex" xmlns:cx8="http://schemas.microsoft.com/office/drawing/2016/5/14/chartex" xmlns:mc="http://schemas.openxmlformats.org/markup-compatibility/2006" xmlns:aink="http://schemas.microsoft.com/office/drawing/2016/ink" xmlns:am3d="http://schemas.microsoft.com/office/drawing/2017/model3d" xmlns:o="urn:schemas-microsoft-com:office:office" xmlns:oel="http://schemas.microsoft.com/office/2019/extlst" xmlns:r="http://schemas.openxmlformats.org/officeDocument/2006/relationships" xmlns:m="http://schemas.openxmlformats.org/officeDocument/2006/math" xmlns:v="urn:schemas-microsoft-com:vml" xmlns:wp14="http://schemas.microsoft.com/office/word/2010/wordprocessingDrawing" xmlns:wp="http://schemas.openxmlformats.org/drawingml/2006/wordprocessingDrawing" xmlns:w10="urn:schemas-microsoft-com:office:word" xmlns:w="http://schemas.openxmlformats.org/wordprocessingml/2006/main" xmlns:w14="http://schemas.microsoft.com/office/word/2010/wordml" xmlns:w15="http://schemas.microsoft.com/office/word/2012/wordml" xmlns:w16cex="http://schemas.microsoft.com/office/word/2018/wordml/cex" xmlns:w16cid="http://schemas.microsoft.com/office/word/2016/wordml/cid" xmlns:w16="http://schemas.microsoft.com/office/word/2018/wordml" xmlns:w16du="http://schemas.microsoft.com/office/word/2023/wordml/word16du" xmlns:w16sdtdh="http://schemas.microsoft.com/office/word/2020/wordml/sdtdatahash" xmlns:w16sdtfl="http://schemas.microsoft.com/office/word/2024/wordml/sdtformatlock" xmlns:w16se="http://schemas.microsoft.com/office/word/2015/wordml/symex" xmlns:wpg="http://schemas.microsoft.com/office/word/2010/wordprocessingGroup" xmlns:wpi="http://schemas.microsoft.com/office/word/2010/wordprocessingInk" xmlns:wne="http://schemas.microsoft.com/office/word/2006/wordml" xmlns:wps="http://schemas.microsoft.com/office/word/2010/wordprocessingShape" mc:Ignorable="w14 w15 w16se w16cid w16 w16cex w16sdtdh w16sdtfl w16du wp14">
   <w:p>
     <w:pPr>
       <w:pStyle w:val="Header"/>
@@ -145,7 +145,7 @@
 </file>
 
 <file path=word/header2.xml><?xml version="1.0" encoding="utf-8"?>
-<w:hdr xmlns:wpc="http://schemas.microsoft.com/office/word/2010/wordprocessingCanvas" xmlns:cx="http://schemas.microsoft.com/office/drawing/2014/chartex" xmlns:cx1="http://schemas.microsoft.com/office/drawing/2015/9/8/chartex" xmlns:cx2="http://schemas.microsoft.com/office/drawing/2015/10/21/chartex" xmlns:cx3="http://schemas.microsoft.com/office/drawing/2016/5/9/chartex" xmlns:cx4="http://schemas.microsoft.com/office/drawing/2016/5/10/chartex" xmlns:cx5="http://schemas.microsoft.com/office/drawing/2016/5/11/chartex" xmlns:cx6="http://schemas.microsoft.com/office/drawing/2016/5/12/chartex" xmlns:cx7="http://schemas.microsoft.com/office/drawing/2016/5/13/chartex" xmlns:cx8="http://schemas.microsoft.com/office/drawing/2016/5/14/chartex" xmlns:mc="http://schemas.openxmlformats.org/markup-compatibility/2006" xmlns:aink="http://schemas.microsoft.com/office/drawing/2016/ink" xmlns:am3d="http://schemas.microsoft.com/office/drawing/2017/model3d" xmlns:o="urn:schemas-microsoft-com:office:office" xmlns:oel="http://schemas.microsoft.com/office/2019/extlst" xmlns:r="http://schemas.openxmlformats.org/officeDocument/2006/relationships" xmlns:m="http://schemas.openxmlformats.org/officeDocument/2006/math" xmlns:v="urn:schemas-microsoft-com:vml" xmlns:wp14="http://schemas.microsoft.com/office/word/2010/wordprocessingDrawing" xmlns:wp="http://schemas.openxmlformats.org/drawingml/2006/wordprocessingDrawing" xmlns:w10="urn:schemas-microsoft-com:office:word" xmlns:w="http://schemas.openxmlformats.org/wordprocessingml/2006/main" xmlns:w14="http://schemas.microsoft.com/office/word/2010/wordml" xmlns:w15="http://schemas.microsoft.com/office/word/2012/wordml" xmlns:w16cex="http://schemas.microsoft.com/office/word/2018/wordml/cex" xmlns:w16cid="http://schemas.microsoft.com/office/word/2016/wordml/cid" xmlns:w16="http://schemas.microsoft.com/office/word/2018/wordml" xmlns:w16sdtdh="http://schemas.microsoft.com/office/word/2020/wordml/sdtdatahash" xmlns:w16se="http://schemas.microsoft.com/office/word/2015/wordml/symex" xmlns:wpg="http://schemas.microsoft.com/office/word/2010/wordprocessingGroup" xmlns:wpi="http://schemas.microsoft.com/office/word/2010/wordprocessingInk" xmlns:wne="http://schemas.microsoft.com/office/word/2006/wordml" xmlns:wps="http://schemas.microsoft.com/office/word/2010/wordprocessingShape" mc:Ignorable="w14 w15 w16se w16cid w16 w16cex w16sdtdh wp14">
+<w:hdr xmlns:wpc="http://schemas.microsoft.com/office/word/2010/wordprocessingCanvas" xmlns:cx="http://schemas.microsoft.com/office/drawing/2014/chartex" xmlns:cx1="http://schemas.microsoft.com/office/drawing/2015/9/8/chartex" xmlns:cx2="http://schemas.microsoft.com/office/drawing/2015/10/21/chartex" xmlns:cx3="http://schemas.microsoft.com/office/drawing/2016/5/9/chartex" xmlns:cx4="http://schemas.microsoft.com/office/drawing/2016/5/10/chartex" xmlns:cx5="http://schemas.microsoft.com/office/drawing/2016/5/11/chartex" xmlns:cx6="http://schemas.microsoft.com/office/drawing/2016/5/12/chartex" xmlns:cx7="http://schemas.microsoft.com/office/drawing/2016/5/13/chartex" xmlns:cx8="http://schemas.microsoft.com/office/drawing/2016/5/14/chartex" xmlns:mc="http://schemas.openxmlformats.org/markup-compatibility/2006" xmlns:aink="http://schemas.microsoft.com/office/drawing/2016/ink" xmlns:am3d="http://schemas.microsoft.com/office/drawing/2017/model3d" xmlns:o="urn:schemas-microsoft-com:office:office" xmlns:oel="http://schemas.microsoft.com/office/2019/extlst" xmlns:r="http://schemas.openxmlformats.org/officeDocument/2006/relationships" xmlns:m="http://schemas.openxmlformats.org/officeDocument/2006/math" xmlns:v="urn:schemas-microsoft-com:vml" xmlns:wp14="http://schemas.microsoft.com/office/word/2010/wordprocessingDrawing" xmlns:wp="http://schemas.openxmlformats.org/drawingml/2006/wordprocessingDrawing" xmlns:w10="urn:schemas-microsoft-com:office:word" xmlns:w="http://schemas.openxmlformats.org/wordprocessingml/2006/main" xmlns:w14="http://schemas.microsoft.com/office/word/2010/wordml" xmlns:w15="http://schemas.microsoft.com/office/word/2012/wordml" xmlns:w16cex="http://schemas.microsoft.com/office/word/2018/wordml/cex" xmlns:w16cid="http://schemas.microsoft.com/office/word/2016/wordml/cid" xmlns:w16="http://schemas.microsoft.com/office/word/2018/wordml" xmlns:w16du="http://schemas.microsoft.com/office/word/2023/wordml/word16du" xmlns:w16sdtdh="http://schemas.microsoft.com/office/word/2020/wordml/sdtdatahash" xmlns:w16sdtfl="http://schemas.microsoft.com/office/word/2024/wordml/sdtformatlock" xmlns:w16se="http://schemas.microsoft.com/office/word/2015/wordml/symex" xmlns:wpg="http://schemas.microsoft.com/office/word/2010/wordprocessingGroup" xmlns:wpi="http://schemas.microsoft.com/office/word/2010/wordprocessingInk" xmlns:wne="http://schemas.microsoft.com/office/word/2006/wordml" xmlns:wps="http://schemas.microsoft.com/office/word/2010/wordprocessingShape" mc:Ignorable="w14 w15 w16se w16cid w16 w16cex w16sdtdh w16sdtfl w16du wp14">
   <w:p>
     <w:pPr>
       <w:pStyle w:val="Header"/>
@@ -155,7 +155,7 @@
 </file>
 
 <file path=word/header3.xml><?xml version="1.0" encoding="utf-8"?>
-<w:hdr xmlns:wpc="http://schemas.microsoft.com/office/word/2010/wordprocessingCanvas" xmlns:cx="http://schemas.microsoft.com/office/drawing/2014/chartex" xmlns:cx1="http://schemas.microsoft.com/office/drawing/2015/9/8/chartex" xmlns:cx2="http://schemas.microsoft.com/office/drawing/2015/10/21/chartex" xmlns:cx3="http://schemas.microsoft.com/office/drawing/2016/5/9/chartex" xmlns:cx4="http://schemas.microsoft.com/office/drawing/2016/5/10/chartex" xmlns:cx5="http://schemas.microsoft.com/office/drawing/2016/5/11/chartex" xmlns:cx6="http://schemas.microsoft.com/office/drawing/2016/5/12/chartex" xmlns:cx7="http://schemas.microsoft.com/office/drawing/2016/5/13/chartex" xmlns:cx8="http://schemas.microsoft.com/office/drawing/2016/5/14/chartex" xmlns:mc="http://schemas.openxmlformats.org/markup-compatibility/2006" xmlns:aink="http://schemas.microsoft.com/office/drawing/2016/ink" xmlns:am3d="http://schemas.microsoft.com/office/drawing/2017/model3d" xmlns:o="urn:schemas-microsoft-com:office:office" xmlns:oel="http://schemas.microsoft.com/office/2019/extlst" xmlns:r="http://schemas.openxmlformats.org/officeDocument/2006/relationships" xmlns:m="http://schemas.openxmlformats.org/officeDocument/2006/math" xmlns:v="urn:schemas-microsoft-com:vml" xmlns:wp14="http://schemas.microsoft.com/office/word/2010/wordprocessingDrawing" xmlns:wp="http://schemas.openxmlformats.org/drawingml/2006/wordprocessingDrawing" xmlns:w10="urn:schemas-microsoft-com:office:word" xmlns:w="http://schemas.openxmlformats.org/wordprocessingml/2006/main" xmlns:w14="http://schemas.microsoft.com/office/word/2010/wordml" xmlns:w15="http://schemas.microsoft.com/office/word/2012/wordml" xmlns:w16cex="http://schemas.microsoft.com/office/word/2018/wordml/cex" xmlns:w16cid="http://schemas.microsoft.com/office/word/2016/wordml/cid" xmlns:w16="http://schemas.microsoft.com/office/word/2018/wordml" xmlns:w16sdtdh="http://schemas.microsoft.com/office/word/2020/wordml/sdtdatahash" xmlns:w16se="http://schemas.microsoft.com/office/word/2015/wordml/symex" xmlns:wpg="http://schemas.microsoft.com/office/word/2010/wordprocessingGroup" xmlns:wpi="http://schemas.microsoft.com/office/word/2010/wordprocessingInk" xmlns:wne="http://schemas.microsoft.com/office/word/2006/wordml" xmlns:wps="http://schemas.microsoft.com/office/word/2010/wordprocessingShape" mc:Ignorable="w14 w15 w16se w16cid w16 w16cex w16sdtdh wp14">
+<w:hdr xmlns:wpc="http://schemas.microsoft.com/office/word/2010/wordprocessingCanvas" xmlns:cx="http://schemas.microsoft.com/office/drawing/2014/chartex" xmlns:cx1="http://schemas.microsoft.com/office/drawing/2015/9/8/chartex" xmlns:cx2="http://schemas.microsoft.com/office/drawing/2015/10/21/chartex" xmlns:cx3="http://schemas.microsoft.com/office/drawing/2016/5/9/chartex" xmlns:cx4="http://schemas.microsoft.com/office/drawing/2016/5/10/chartex" xmlns:cx5="http://schemas.microsoft.com/office/drawing/2016/5/11/chartex" xmlns:cx6="http://schemas.microsoft.com/office/drawing/2016/5/12/chartex" xmlns:cx7="http://schemas.microsoft.com/office/drawing/2016/5/13/chartex" xmlns:cx8="http://schemas.microsoft.com/office/drawing/2016/5/14/chartex" xmlns:mc="http://schemas.openxmlformats.org/markup-compatibility/2006" xmlns:aink="http://schemas.microsoft.com/office/drawing/2016/ink" xmlns:am3d="http://schemas.microsoft.com/office/drawing/2017/model3d" xmlns:o="urn:schemas-microsoft-com:office:office" xmlns:oel="http://schemas.microsoft.com/office/2019/extlst" xmlns:r="http://schemas.openxmlformats.org/officeDocument/2006/relationships" xmlns:m="http://schemas.openxmlformats.org/officeDocument/2006/math" xmlns:v="urn:schemas-microsoft-com:vml" xmlns:wp14="http://schemas.microsoft.com/office/word/2010/wordprocessingDrawing" xmlns:wp="http://schemas.openxmlformats.org/drawingml/2006/wordprocessingDrawing" xmlns:w10="urn:schemas-microsoft-com:office:word" xmlns:w="http://schemas.openxmlformats.org/wordprocessingml/2006/main" xmlns:w14="http://schemas.microsoft.com/office/word/2010/wordml" xmlns:w15="http://schemas.microsoft.com/office/word/2012/wordml" xmlns:w16cex="http://schemas.microsoft.com/office/word/2018/wordml/cex" xmlns:w16cid="http://schemas.microsoft.com/office/word/2016/wordml/cid" xmlns:w16="http://schemas.microsoft.com/office/word/2018/wordml" xmlns:w16du="http://schemas.microsoft.com/office/word/2023/wordml/word16du" xmlns:w16sdtdh="http://schemas.microsoft.com/office/word/2020/wordml/sdtdatahash" xmlns:w16sdtfl="http://schemas.microsoft.com/office/word/2024/wordml/sdtformatlock" xmlns:w16se="http://schemas.microsoft.com/office/word/2015/wordml/symex" xmlns:wpg="http://schemas.microsoft.com/office/word/2010/wordprocessingGroup" xmlns:wpi="http://schemas.microsoft.com/office/word/2010/wordprocessingInk" xmlns:wne="http://schemas.microsoft.com/office/word/2006/wordml" xmlns:wps="http://schemas.microsoft.com/office/word/2010/wordprocessingShape" mc:Ignorable="w14 w15 w16se w16cid w16 w16cex w16sdtdh w16sdtfl w16du wp14">
   <w:p>
     <w:pPr>
       <w:pStyle w:val="Header"/>
@@ -165,7 +165,7 @@
 </file>
 
 <file path=word/styles.xml><?xml version="1.0" encoding="utf-8"?>
-<w:styles xmlns:mc="http://schemas.openxmlformats.org/markup-compatibility/2006" xmlns:r="http://schemas.openxmlformats.org/officeDocument/2006/relationships" xmlns:w="http://schemas.openxmlformats.org/wordprocessingml/2006/main" xmlns:w14="http://schemas.microsoft.com/office/word/2010/wordml" xmlns:w15="http://schemas.microsoft.com/office/word/2012/wordml" xmlns:w16cex="http://schemas.microsoft.com/office/word/2018/wordml/cex" xmlns:w16cid="http://schemas.microsoft.com/office/word/2016/wordml/cid" xmlns:w16="http://schemas.microsoft.com/office/word/2018/wordml" xmlns:w16sdtdh="http://schemas.microsoft.com/office/word/2020/wordml/sdtdatahash" xmlns:w16se="http://schemas.microsoft.com/office/word/2015/wordml/symex" mc:Ignorable="w14 w15 w16se w16cid w16 w16cex w16sdtdh">
+<w:styles xmlns:mc="http://schemas.openxmlformats.org/markup-compatibility/2006" xmlns:r="http://schemas.openxmlformats.org/officeDocument/2006/relationships" xmlns:w="http://schemas.openxmlformats.org/wordprocessingml/2006/main" xmlns:w14="http://schemas.microsoft.com/office/word/2010/wordml" xmlns:w15="http://schemas.microsoft.com/office/word/2012/wordml" xmlns:w16cex="http://schemas.microsoft.com/office/word/2018/wordml/cex" xmlns:w16cid="http://schemas.microsoft.com/office/word/2016/wordml/cid" xmlns:w16="http://schemas.microsoft.com/office/word/2018/wordml" xmlns:w16du="http://schemas.microsoft.com/office/word/2023/wordml/word16du" xmlns:w16sdtdh="http://schemas.microsoft.com/office/word/2020/wordml/sdtdatahash" xmlns:w16sdtfl="http://schemas.microsoft.com/office/word/2024/wordml/sdtformatlock" xmlns:w16se="http://schemas.microsoft.com/office/word/2015/wordml/symex" mc:Ignorable="w14 w15 w16se w16cid w16 w16cex w16sdtdh w16sdtfl w16du">
   <w:docDefaults>
     <w:rPrDefault>
       <w:rPr>
@@ -287,6 +287,7 @@
     <w:lsdException w:name="HTML Sample" w:semiHidden="1" w:unhideWhenUsed="1"/>
     <w:lsdException w:name="HTML Typewriter" w:semiHidden="1" w:unhideWhenUsed="1"/>
     <w:lsdException w:name="HTML Variable" w:semiHidden="1" w:unhideWhenUsed="1"/>
+    <w:lsdException w:name="Normal Table" w:semiHidden="1" w:unhideWhenUsed="1"/>
     <w:lsdException w:name="annotation subject" w:semiHidden="1" w:unhideWhenUsed="1"/>
     <w:lsdException w:name="No List" w:semiHidden="1" w:unhideWhenUsed="1"/>
     <w:lsdException w:name="Outline List 1" w:semiHidden="1" w:unhideWhenUsed="1"/>
@@ -329,8 +330,11 @@
     <w:lsdException w:name="Table Contemporary" w:semiHidden="1" w:unhideWhenUsed="1"/>
     <w:lsdException w:name="Table Elegant" w:semiHidden="1" w:unhideWhenUsed="1"/>
     <w:lsdException w:name="Table Professional" w:semiHidden="1" w:unhideWhenUsed="1"/>
+    <w:lsdException w:name="Table Subtle 1" w:semiHidden="1" w:unhideWhenUsed="1"/>
     <w:lsdException w:name="Table Subtle 2" w:semiHidden="1" w:unhideWhenUsed="1"/>
     <w:lsdException w:name="Table Web 1" w:semiHidden="1" w:unhideWhenUsed="1"/>
+    <w:lsdException w:name="Table Web 2" w:semiHidden="1" w:unhideWhenUsed="1"/>
+    <w:lsdException w:name="Table Web 3" w:semiHidden="1" w:unhideWhenUsed="1"/>
     <w:lsdException w:name="Balloon Text" w:semiHidden="1" w:unhideWhenUsed="1"/>
     <w:lsdException w:name="Table Grid" w:uiPriority="39"/>
     <w:lsdException w:name="Table Theme" w:semiHidden="1" w:unhideWhenUsed="1"/>
@@ -558,7 +562,7 @@
   <w:style w:type="paragraph" w:default="1" w:styleId="Normal">
     <w:name w:val="Normal"/>
     <w:qFormat/>
-    <w:rsid w:val="005014CA"/>
+    <w:rsid w:val="009714CB"/>
     <w:pPr>
       <w:spacing w:before="120" w:after="120" w:line="240" w:lineRule="auto"/>
       <w:jc w:val="both"/>
@@ -645,6 +649,35 @@
     <w:rPr>
       <w:rFonts w:ascii="Times New Roman" w:hAnsi="Times New Roman"/>
       <w:sz w:val="24"/>
+    </w:rPr>
+  </w:style>
+  <w:style w:type="paragraph" w:styleId="BalloonText">
+    <w:name w:val="Balloon Text"/>
+    <w:basedOn w:val="Normal"/>
+    <w:link w:val="BalloonTextChar"/>
+    <w:uiPriority w:val="99"/>
+    <w:semiHidden/>
+    <w:unhideWhenUsed/>
+    <w:rsid w:val="009714CB"/>
+    <w:pPr>
+      <w:spacing w:before="0" w:after="0"/>
+    </w:pPr>
+    <w:rPr>
+      <w:rFonts w:cs="Segoe UI"/>
+      <w:szCs w:val="18"/>
+    </w:rPr>
+  </w:style>
+  <w:style w:type="character" w:customStyle="1" w:styleId="BalloonTextChar">
+    <w:name w:val="Balloon Text Char"/>
+    <w:basedOn w:val="DefaultParagraphFont"/>
+    <w:link w:val="BalloonText"/>
+    <w:uiPriority w:val="99"/>
+    <w:semiHidden/>
+    <w:rsid w:val="009714CB"/>
+    <w:rPr>
+      <w:rFonts w:ascii="Times New Roman" w:hAnsi="Times New Roman" w:cs="Segoe UI"/>
+      <w:sz w:val="24"/>
+      <w:szCs w:val="18"/>
     </w:rPr>
   </w:style>
 </w:styles>

</xml_diff>